<commit_message>
Replace AI adoption policy with revised document
</commit_message>
<xml_diff>
--- a/04-adoption-policy/CFD_AI_Adoption_Policy.docx
+++ b/04-adoption-policy/CFD_AI_Adoption_Policy.docx
@@ -631,10 +631,102 @@
       <w:r>
         <w:t>Restart requires a documented cause, corrective action, new testing, and written approval from the Chief and ITD, with Law review where rights or protected data are involved. Repeated or uncorrectable failures retire the use case. Do not delete logs to conceal a mistake.</w:t>
       </w:r>
+      <w:r>
+        <w:t xml:space="preserve"> </w:t>
+      </w:r>
+    </w:p>
+    <w:p/>
+    <w:p/>
+    <w:p/>
+    <w:p>
+      <w:pPr>
+        <w:rPr>
+          <w:b/>
+          <w:bCs/>
+        </w:rPr>
+      </w:pPr>
+      <w:r>
+        <w:rPr>
+          <w:b/>
+          <w:bCs/>
+        </w:rPr>
+        <w:t>AI Security Compliance</w:t>
+      </w:r>
     </w:p>
     <w:p>
       <w:r>
-        <w:br w:type="page"/>
+        <w:t xml:space="preserve">In compliance with the </w:t>
+      </w:r>
+      <w:r>
+        <w:t xml:space="preserve">citywide </w:t>
+      </w:r>
+      <w:r>
+        <w:t>guidance</w:t>
+      </w:r>
+      <w:r>
+        <w:t xml:space="preserve"> of </w:t>
+      </w:r>
+      <w:r>
+        <w:t>W</w:t>
+      </w:r>
+      <w:r>
+        <w:t xml:space="preserve">ritten </w:t>
+      </w:r>
+      <w:r>
+        <w:t>I</w:t>
+      </w:r>
+      <w:r>
+        <w:t xml:space="preserve">nformation </w:t>
+      </w:r>
+      <w:r>
+        <w:t>S</w:t>
+      </w:r>
+      <w:r>
+        <w:t>ecurity</w:t>
+      </w:r>
+      <w:r>
+        <w:t xml:space="preserve"> </w:t>
+      </w:r>
+      <w:r>
+        <w:t>P</w:t>
+      </w:r>
+      <w:r>
+        <w:t>olicy (WISP)</w:t>
+      </w:r>
+      <w:r>
+        <w:t xml:space="preserve"> </w:t>
+      </w:r>
+      <w:r>
+        <w:t>explicitly applying to the</w:t>
+      </w:r>
+      <w:r>
+        <w:t xml:space="preserve"> </w:t>
+      </w:r>
+      <w:r>
+        <w:t>Cambridge</w:t>
+      </w:r>
+      <w:r>
+        <w:t xml:space="preserve"> Fire Department, a</w:t>
+      </w:r>
+      <w:r>
+        <w:t xml:space="preserve">n isolated development and testing </w:t>
+      </w:r>
+      <w:proofErr w:type="gramStart"/>
+      <w:r>
+        <w:t>environment (‘</w:t>
+      </w:r>
+      <w:proofErr w:type="gramEnd"/>
+      <w:r>
+        <w:t>AI sandbox’)</w:t>
+      </w:r>
+      <w:r>
+        <w:t xml:space="preserve"> may be used</w:t>
+      </w:r>
+      <w:r>
+        <w:t xml:space="preserve"> for creating and evaluating AI-generated tools before operational deployment.</w:t>
+      </w:r>
+      <w:r>
+        <w:t xml:space="preserve">   </w:t>
       </w:r>
     </w:p>
     <w:p>
@@ -710,29 +802,42 @@
     </w:p>
     <w:p>
       <w:r>
-        <w:t xml:space="preserve">The template’s Centaur model supports a clear division: AI prepares a bounded draft; a person verifies and decides. Iterative human–AI collaboration, described as a Cyborg approach, is permissible only within the same data and review boundaries. Self-Automator behavior—delegating the full task and accepting the result without independent checks—is prohibited. </w:t>
+        <w:t xml:space="preserve">The template’s Centaur model supports a clear division: AI prepares a bounded draft; a person verifies and decides. Iterative human–AI collaboration, described as a Cyborg approach, is </w:t>
+      </w:r>
+      <w:r>
+        <w:lastRenderedPageBreak/>
+        <w:t xml:space="preserve">permissible only within the same data and review boundaries. Self-Automator behavior—delegating the full task and accepting the result without independent checks—is prohibited. </w:t>
       </w:r>
     </w:p>
     <w:p>
       <w:r>
         <w:t>The Beto and Dr. Kendale prompt makes competence a condition of access: staff must demonstrate that they can spot wrong content before being authorized to review it. Human oversight must be observable and resourced, not ceremonial.</w:t>
       </w:r>
+      <w:r>
+        <w:t xml:space="preserve"> </w:t>
+      </w:r>
     </w:p>
+    <w:p/>
     <w:p>
-      <w:r>
-        <w:br w:type="page"/>
-      </w:r>
-    </w:p>
-    <w:p>
-      <w:pPr>
-        <w:pStyle w:val="Heading1"/>
-      </w:pPr>
-    </w:p>
-    <w:p>
-      <w:pPr>
-        <w:pStyle w:val="Heading1"/>
-      </w:pPr>
-      <w:r>
+      <w:pPr>
+        <w:rPr>
+          <w:rFonts w:asciiTheme="majorHAnsi" w:hAnsiTheme="majorHAnsi" w:cstheme="majorHAnsi"/>
+          <w:b/>
+          <w:bCs/>
+          <w:color w:val="365F91" w:themeColor="accent1" w:themeShade="BF"/>
+          <w:sz w:val="28"/>
+          <w:szCs w:val="24"/>
+        </w:rPr>
+      </w:pPr>
+      <w:r>
+        <w:rPr>
+          <w:rFonts w:asciiTheme="majorHAnsi" w:hAnsiTheme="majorHAnsi" w:cstheme="majorHAnsi"/>
+          <w:b/>
+          <w:bCs/>
+          <w:color w:val="365F91" w:themeColor="accent1" w:themeShade="BF"/>
+          <w:sz w:val="28"/>
+          <w:szCs w:val="24"/>
+        </w:rPr>
         <w:t>IV. Power</w:t>
       </w:r>
     </w:p>
@@ -796,6 +901,7 @@
     </w:p>
     <w:p>
       <w:r>
+        <w:lastRenderedPageBreak/>
         <w:t>Use the GovAI repository’s AI Policy and Governance Handbook to structure the approval record, its impact-assessment form to examine affected groups, and its Incident Response Plan to develop a local response checklist. These are supporting resources, not automatic approvals (GovAI Coalition, n.d.). Record the owner, task, tool/version, data boundary, reviewers, evidence, costs, approval expiry, and rollback steps for each pilot. Publish a nonsensitive summary and review date.</w:t>
       </w:r>
       <w:r>
@@ -899,6 +1005,7 @@
     </w:p>
     <w:p>
       <w:r>
+        <w:lastRenderedPageBreak/>
         <w:t>AI assistance disclosure: This proposal was drafted with OpenAI ChatGPT assistance on October 22, 2026, using the supplied template, slides, and cited sources. Team and departmental review remain pending. Record the available model/version when submitting the final team-approved document.</w:t>
       </w:r>
     </w:p>
@@ -1929,7 +2036,6 @@
   <w:style w:type="character" w:default="1" w:styleId="DefaultParagraphFont">
     <w:name w:val="Default Paragraph Font"/>
     <w:uiPriority w:val="1"/>
-    <w:semiHidden/>
     <w:unhideWhenUsed/>
   </w:style>
   <w:style w:type="table" w:default="1" w:styleId="TableNormal">

</xml_diff>